<commit_message>
Right before session 1
</commit_message>
<xml_diff>
--- a/sesion-01/Handout_Sesion_01.docx
+++ b/sesion-01/Handout_Sesion_01.docx
@@ -153,6 +153,328 @@
           <w:szCs w:val="21"/>
         </w:rPr>
         <w:t xml:space="preserve">Lo que ya haces con regresiones, clasificadores o métodos de emparejamiento no está fuera de la inteligencia artificial: está en el anillo del aprendizaje automático. Los modelos de lenguaje son el anillo de adentro, el más reciente, y el único que trabaja con lenguaje.</w:t>
+      </w:r>
+    </w:p>
+    <w:p>
+      <w:pPr>
+        <w:pStyle w:val="Heading2"/>
+        <w:spacing w:after="100" w:before="240"/>
+      </w:pPr>
+      <w:r>
+        <w:rPr>
+          <w:rFonts w:ascii="Arial" w:cs="Arial" w:eastAsia="Arial" w:hAnsi="Arial"/>
+          <w:b/>
+          <w:bCs/>
+          <w:color w:val="2E7D7D"/>
+          <w:sz w:val="22"/>
+          <w:szCs w:val="22"/>
+        </w:rPr>
+        <w:t xml:space="preserve">Dos palabras que no significan lo mismo</w:t>
+      </w:r>
+    </w:p>
+    <w:p>
+      <w:pPr>
+        <w:spacing w:after="120" w:line="285"/>
+        <w:jc w:val="both"/>
+      </w:pPr>
+      <w:r>
+        <w:rPr>
+          <w:rFonts w:ascii="Arial" w:cs="Arial" w:eastAsia="Arial" w:hAnsi="Arial"/>
+          <w:b w:val="false"/>
+          <w:bCs w:val="false"/>
+          <w:i w:val="false"/>
+          <w:iCs w:val="false"/>
+          <w:sz w:val="21"/>
+          <w:szCs w:val="21"/>
+        </w:rPr>
+        <w:t xml:space="preserve">Las vas a oír todo el curso. Conviene separarlas, porque se gobiernan distinto.</w:t>
+      </w:r>
+    </w:p>
+    <w:tbl>
+      <w:tblPr>
+        <w:tblW w:type="dxa" w:w="9360"/>
+        <w:tblBorders>
+          <w:top w:val="single" w:color="8EA9DB" w:sz="4"/>
+          <w:left w:val="single" w:color="8EA9DB" w:sz="4"/>
+          <w:bottom w:val="single" w:color="8EA9DB" w:sz="4"/>
+          <w:right w:val="single" w:color="8EA9DB" w:sz="4"/>
+          <w:insideH w:val="single" w:color="C9D6DA" w:sz="2"/>
+          <w:insideV w:val="single" w:color="C9D6DA" w:sz="2"/>
+        </w:tblBorders>
+      </w:tblPr>
+      <w:tblGrid>
+        <w:gridCol w:w="2200"/>
+        <w:gridCol w:w="3600"/>
+        <w:gridCol w:w="3560"/>
+      </w:tblGrid>
+      <w:tr>
+        <w:trPr>
+          <w:tblHeader/>
+        </w:trPr>
+        <w:tc>
+          <w:tcPr>
+            <w:tcW w:type="dxa" w:w="2200"/>
+            <w:shd w:fill="D7E7E7" w:color="auto" w:val="clear"/>
+            <w:tcMar>
+              <w:top w:type="dxa" w:w="80"/>
+              <w:left w:type="dxa" w:w="100"/>
+              <w:bottom w:type="dxa" w:w="80"/>
+              <w:right w:type="dxa" w:w="100"/>
+            </w:tcMar>
+          </w:tcPr>
+          <w:p>
+            <w:pPr>
+              <w:spacing w:after="0" w:line="275"/>
+            </w:pPr>
+            <w:r>
+              <w:rPr>
+                <w:rFonts w:ascii="Arial" w:cs="Arial" w:eastAsia="Arial" w:hAnsi="Arial"/>
+                <w:b/>
+                <w:bCs/>
+                <w:sz w:val="19"/>
+                <w:szCs w:val="19"/>
+              </w:rPr>
+              <w:t xml:space="preserve">Palabra</w:t>
+            </w:r>
+          </w:p>
+        </w:tc>
+        <w:tc>
+          <w:tcPr>
+            <w:tcW w:type="dxa" w:w="3600"/>
+            <w:shd w:fill="D7E7E7" w:color="auto" w:val="clear"/>
+            <w:tcMar>
+              <w:top w:type="dxa" w:w="80"/>
+              <w:left w:type="dxa" w:w="100"/>
+              <w:bottom w:type="dxa" w:w="80"/>
+              <w:right w:type="dxa" w:w="100"/>
+            </w:tcMar>
+          </w:tcPr>
+          <w:p>
+            <w:pPr>
+              <w:spacing w:after="0" w:line="275"/>
+            </w:pPr>
+            <w:r>
+              <w:rPr>
+                <w:rFonts w:ascii="Arial" w:cs="Arial" w:eastAsia="Arial" w:hAnsi="Arial"/>
+                <w:b/>
+                <w:bCs/>
+                <w:sz w:val="19"/>
+                <w:szCs w:val="19"/>
+              </w:rPr>
+              <w:t xml:space="preserve">Qué es</w:t>
+            </w:r>
+          </w:p>
+        </w:tc>
+        <w:tc>
+          <w:tcPr>
+            <w:tcW w:type="dxa" w:w="3560"/>
+            <w:shd w:fill="D7E7E7" w:color="auto" w:val="clear"/>
+            <w:tcMar>
+              <w:top w:type="dxa" w:w="80"/>
+              <w:left w:type="dxa" w:w="100"/>
+              <w:bottom w:type="dxa" w:w="80"/>
+              <w:right w:type="dxa" w:w="100"/>
+            </w:tcMar>
+          </w:tcPr>
+          <w:p>
+            <w:pPr>
+              <w:spacing w:after="0" w:line="275"/>
+            </w:pPr>
+            <w:r>
+              <w:rPr>
+                <w:rFonts w:ascii="Arial" w:cs="Arial" w:eastAsia="Arial" w:hAnsi="Arial"/>
+                <w:b/>
+                <w:bCs/>
+                <w:sz w:val="19"/>
+                <w:szCs w:val="19"/>
+              </w:rPr>
+              <w:t xml:space="preserve">Cuándo la usamos</w:t>
+            </w:r>
+          </w:p>
+        </w:tc>
+      </w:tr>
+      <w:tr>
+        <w:tc>
+          <w:tcPr>
+            <w:tcW w:type="dxa" w:w="2200"/>
+            <w:tcMar>
+              <w:top w:type="dxa" w:w="80"/>
+              <w:left w:type="dxa" w:w="100"/>
+              <w:bottom w:type="dxa" w:w="80"/>
+              <w:right w:type="dxa" w:w="100"/>
+            </w:tcMar>
+          </w:tcPr>
+          <w:p>
+            <w:pPr>
+              <w:spacing w:after="0" w:line="275"/>
+            </w:pPr>
+            <w:r>
+              <w:rPr>
+                <w:rFonts w:ascii="Arial" w:cs="Arial" w:eastAsia="Arial" w:hAnsi="Arial"/>
+                <w:b/>
+                <w:bCs/>
+                <w:sz w:val="19"/>
+                <w:szCs w:val="19"/>
+              </w:rPr>
+              <w:t xml:space="preserve">El modelo</w:t>
+            </w:r>
+          </w:p>
+        </w:tc>
+        <w:tc>
+          <w:tcPr>
+            <w:tcW w:type="dxa" w:w="3600"/>
+            <w:tcMar>
+              <w:top w:type="dxa" w:w="80"/>
+              <w:left w:type="dxa" w:w="100"/>
+              <w:bottom w:type="dxa" w:w="80"/>
+              <w:right w:type="dxa" w:w="100"/>
+            </w:tcMar>
+          </w:tcPr>
+          <w:p>
+            <w:pPr>
+              <w:spacing w:after="0" w:line="275"/>
+            </w:pPr>
+            <w:r>
+              <w:rPr>
+                <w:rFonts w:ascii="Arial" w:cs="Arial" w:eastAsia="Arial" w:hAnsi="Arial"/>
+                <w:b w:val="false"/>
+                <w:bCs w:val="false"/>
+                <w:sz w:val="19"/>
+                <w:szCs w:val="19"/>
+              </w:rPr>
+              <w:t xml:space="preserve">Lo que predice palabras. Vive por debajo, no lo ves. Es lo que inventa referencias, lo que no calcula y lo que trae sesgos. Tiene un límite de cuánto texto lee de una vez.</w:t>
+            </w:r>
+          </w:p>
+        </w:tc>
+        <w:tc>
+          <w:tcPr>
+            <w:tcW w:type="dxa" w:w="3560"/>
+            <w:tcMar>
+              <w:top w:type="dxa" w:w="80"/>
+              <w:left w:type="dxa" w:w="100"/>
+              <w:bottom w:type="dxa" w:w="80"/>
+              <w:right w:type="dxa" w:w="100"/>
+            </w:tcMar>
+          </w:tcPr>
+          <w:p>
+            <w:pPr>
+              <w:spacing w:after="0" w:line="275"/>
+            </w:pPr>
+            <w:r>
+              <w:rPr>
+                <w:rFonts w:ascii="Arial" w:cs="Arial" w:eastAsia="Arial" w:hAnsi="Arial"/>
+                <w:b w:val="false"/>
+                <w:bCs w:val="false"/>
+                <w:sz w:val="19"/>
+                <w:szCs w:val="19"/>
+              </w:rPr>
+              <w:t xml:space="preserve">Cuando hablamos de lo que falla.</w:t>
+            </w:r>
+          </w:p>
+        </w:tc>
+      </w:tr>
+      <w:tr>
+        <w:tc>
+          <w:tcPr>
+            <w:tcW w:type="dxa" w:w="2200"/>
+            <w:tcMar>
+              <w:top w:type="dxa" w:w="80"/>
+              <w:left w:type="dxa" w:w="100"/>
+              <w:bottom w:type="dxa" w:w="80"/>
+              <w:right w:type="dxa" w:w="100"/>
+            </w:tcMar>
+          </w:tcPr>
+          <w:p>
+            <w:pPr>
+              <w:spacing w:after="0" w:line="275"/>
+            </w:pPr>
+            <w:r>
+              <w:rPr>
+                <w:rFonts w:ascii="Arial" w:cs="Arial" w:eastAsia="Arial" w:hAnsi="Arial"/>
+                <w:b/>
+                <w:bCs/>
+                <w:sz w:val="19"/>
+                <w:szCs w:val="19"/>
+              </w:rPr>
+              <w:t xml:space="preserve">La herramienta</w:t>
+            </w:r>
+          </w:p>
+        </w:tc>
+        <w:tc>
+          <w:tcPr>
+            <w:tcW w:type="dxa" w:w="3600"/>
+            <w:tcMar>
+              <w:top w:type="dxa" w:w="80"/>
+              <w:left w:type="dxa" w:w="100"/>
+              <w:bottom w:type="dxa" w:w="80"/>
+              <w:right w:type="dxa" w:w="100"/>
+            </w:tcMar>
+          </w:tcPr>
+          <w:p>
+            <w:pPr>
+              <w:spacing w:after="0" w:line="275"/>
+            </w:pPr>
+            <w:r>
+              <w:rPr>
+                <w:rFonts w:ascii="Arial" w:cs="Arial" w:eastAsia="Arial" w:hAnsi="Arial"/>
+                <w:b w:val="false"/>
+                <w:bCs w:val="false"/>
+                <w:sz w:val="19"/>
+                <w:szCs w:val="19"/>
+              </w:rPr>
+              <w:t xml:space="preserve">El producto que abres: Copilot, ChatGPT, Claude, Gemini. Tiene un contrato, o no. Tiene configuración de privacidad. Tiene un precio. Varias herramientas pueden usar el mismo modelo por debajo.</w:t>
+            </w:r>
+          </w:p>
+        </w:tc>
+        <w:tc>
+          <w:tcPr>
+            <w:tcW w:type="dxa" w:w="3560"/>
+            <w:tcMar>
+              <w:top w:type="dxa" w:w="80"/>
+              <w:left w:type="dxa" w:w="100"/>
+              <w:bottom w:type="dxa" w:w="80"/>
+              <w:right w:type="dxa" w:w="100"/>
+            </w:tcMar>
+          </w:tcPr>
+          <w:p>
+            <w:pPr>
+              <w:spacing w:after="0" w:line="275"/>
+            </w:pPr>
+            <w:r>
+              <w:rPr>
+                <w:rFonts w:ascii="Arial" w:cs="Arial" w:eastAsia="Arial" w:hAnsi="Arial"/>
+                <w:b w:val="false"/>
+                <w:bCs w:val="false"/>
+                <w:sz w:val="19"/>
+                <w:szCs w:val="19"/>
+              </w:rPr>
+              <w:t xml:space="preserve">Cuando hablamos de dónde puedes meter información.</w:t>
+            </w:r>
+          </w:p>
+        </w:tc>
+      </w:tr>
+    </w:tbl>
+    <w:p>
+      <w:pPr>
+        <w:spacing w:after="160"/>
+      </w:pPr>
+    </w:p>
+    <w:p>
+      <w:pPr>
+        <w:spacing w:after="120" w:line="285"/>
+        <w:jc w:val="both"/>
+      </w:pPr>
+      <w:r>
+        <w:rPr>
+          <w:rFonts w:ascii="Arial" w:cs="Arial" w:eastAsia="Arial" w:hAnsi="Arial"/>
+          <w:b/>
+          <w:bCs/>
+          <w:i w:val="false"/>
+          <w:iCs w:val="false"/>
+          <w:sz w:val="21"/>
+          <w:szCs w:val="21"/>
+        </w:rPr>
+        <w:t xml:space="preserve">Que una herramienta sea segura no vuelve confiable lo que escribe el modelo. Son dos preguntas separadas y las dos hay que contestarlas.</w:t>
       </w:r>
     </w:p>
     <w:p>
@@ -1521,7 +1843,7 @@
                 <w:sz w:val="19"/>
                 <w:szCs w:val="19"/>
               </w:rPr>
-              <w:t xml:space="preserve">En cualquier herramienta del curso.</w:t>
+              <w:t xml:space="preserve">En Copilot y en las siete herramientas gratuitas del curso.</w:t>
             </w:r>
           </w:p>
         </w:tc>
@@ -1681,7 +2003,7 @@
                 <w:sz w:val="19"/>
                 <w:szCs w:val="19"/>
               </w:rPr>
-              <w:t xml:space="preserve">En ninguna. Si lo necesitas, primero lo enmascaras.</w:t>
+              <w:t xml:space="preserve">Ni en Copilot ni en las gratuitas. Primero lo enmascaras.</w:t>
             </w:r>
           </w:p>
         </w:tc>
@@ -1719,7 +2041,7 @@
           <w:sz w:val="22"/>
           <w:szCs w:val="22"/>
         </w:rPr>
-        <w:t xml:space="preserve">Tu tarea de privacidad, cinco minutos por herramienta</w:t>
+        <w:t xml:space="preserve">Qué hace cada herramienta con lo que le das</w:t>
       </w:r>
     </w:p>
     <w:p>
@@ -1737,71 +2059,197 @@
           <w:sz w:val="21"/>
           <w:szCs w:val="21"/>
         </w:rPr>
-        <w:t xml:space="preserve">Las herramientas gratuitas usan tus conversaciones para entrenar al modelo, salvo que tú lo apagues. Viene prendido de fábrica. Hazlo hoy con ChatGPT y repítelo con cada herramienta nueva el día que la abras.</w:t>
-      </w:r>
-    </w:p>
-    <w:p>
-      <w:pPr>
-        <w:spacing w:after="90" w:line="280"/>
-        <w:ind w:left="520" w:hanging="260"/>
-        <w:jc w:val="both"/>
-      </w:pPr>
-      <w:r>
-        <w:rPr>
-          <w:rFonts w:ascii="Arial" w:cs="Arial" w:eastAsia="Arial" w:hAnsi="Arial"/>
-          <w:sz w:val="21"/>
-          <w:szCs w:val="21"/>
-        </w:rPr>
-        <w:t xml:space="preserve">•   Entra a la configuración y busca la sección de datos, privacidad o controles de datos.</w:t>
-      </w:r>
-    </w:p>
-    <w:p>
-      <w:pPr>
-        <w:spacing w:after="90" w:line="280"/>
-        <w:ind w:left="520" w:hanging="260"/>
-        <w:jc w:val="both"/>
-      </w:pPr>
-      <w:r>
-        <w:rPr>
-          <w:rFonts w:ascii="Arial" w:cs="Arial" w:eastAsia="Arial" w:hAnsi="Arial"/>
-          <w:sz w:val="21"/>
-          <w:szCs w:val="21"/>
-        </w:rPr>
-        <w:t xml:space="preserve">•   Apaga la opción de mejorar el modelo. El nombre cambia entre herramientas, la opción es la misma.</w:t>
-      </w:r>
-    </w:p>
-    <w:p>
-      <w:pPr>
-        <w:spacing w:after="90" w:line="280"/>
-        <w:ind w:left="520" w:hanging="260"/>
-        <w:jc w:val="both"/>
-      </w:pPr>
-      <w:r>
-        <w:rPr>
-          <w:rFonts w:ascii="Arial" w:cs="Arial" w:eastAsia="Arial" w:hAnsi="Arial"/>
-          <w:sz w:val="21"/>
-          <w:szCs w:val="21"/>
-        </w:rPr>
-        <w:t xml:space="preserve">•   Anótalo en tu bitácora, con la fecha.</w:t>
-      </w:r>
-    </w:p>
-    <w:p>
-      <w:pPr>
-        <w:spacing w:after="120" w:line="285"/>
-        <w:jc w:val="both"/>
-      </w:pPr>
-      <w:r>
-        <w:rPr>
-          <w:rFonts w:ascii="Arial" w:cs="Arial" w:eastAsia="Arial" w:hAnsi="Arial"/>
-          <w:b/>
-          <w:bCs/>
-          <w:i w:val="false"/>
-          <w:iCs w:val="false"/>
-          <w:sz w:val="21"/>
-          <w:szCs w:val="21"/>
-        </w:rPr>
-        <w:t xml:space="preserve">Ojo: esto no cambia el semáforo. Aun con el entrenamiento apagado, esas herramientas siguen siendo solo para información verde.</w:t>
-      </w:r>
+        <w:t xml:space="preserve">Las ocho herramientas del curso no se diferencian por calidad, sino por contrato. Eso decide qué tienes que hacer con cada una.</w:t>
+      </w:r>
+    </w:p>
+    <w:tbl>
+      <w:tblPr>
+        <w:tblW w:type="dxa" w:w="9360"/>
+        <w:tblBorders>
+          <w:top w:val="single" w:color="8EA9DB" w:sz="4"/>
+          <w:left w:val="single" w:color="8EA9DB" w:sz="4"/>
+          <w:bottom w:val="single" w:color="8EA9DB" w:sz="4"/>
+          <w:right w:val="single" w:color="8EA9DB" w:sz="4"/>
+          <w:insideH w:val="single" w:color="C9D6DA" w:sz="2"/>
+          <w:insideV w:val="single" w:color="C9D6DA" w:sz="2"/>
+        </w:tblBorders>
+      </w:tblPr>
+      <w:tblGrid>
+        <w:gridCol w:w="2800"/>
+        <w:gridCol w:w="6560"/>
+      </w:tblGrid>
+      <w:tr>
+        <w:trPr>
+          <w:tblHeader/>
+        </w:trPr>
+        <w:tc>
+          <w:tcPr>
+            <w:tcW w:type="dxa" w:w="2800"/>
+            <w:shd w:fill="D7E7E7" w:color="auto" w:val="clear"/>
+            <w:tcMar>
+              <w:top w:type="dxa" w:w="80"/>
+              <w:left w:type="dxa" w:w="100"/>
+              <w:bottom w:type="dxa" w:w="80"/>
+              <w:right w:type="dxa" w:w="100"/>
+            </w:tcMar>
+          </w:tcPr>
+          <w:p>
+            <w:pPr>
+              <w:spacing w:after="0" w:line="275"/>
+            </w:pPr>
+            <w:r>
+              <w:rPr>
+                <w:rFonts w:ascii="Arial" w:cs="Arial" w:eastAsia="Arial" w:hAnsi="Arial"/>
+                <w:b/>
+                <w:bCs/>
+                <w:sz w:val="19"/>
+                <w:szCs w:val="19"/>
+              </w:rPr>
+              <w:t xml:space="preserve">Herramienta</w:t>
+            </w:r>
+          </w:p>
+        </w:tc>
+        <w:tc>
+          <w:tcPr>
+            <w:tcW w:type="dxa" w:w="6560"/>
+            <w:shd w:fill="D7E7E7" w:color="auto" w:val="clear"/>
+            <w:tcMar>
+              <w:top w:type="dxa" w:w="80"/>
+              <w:left w:type="dxa" w:w="100"/>
+              <w:bottom w:type="dxa" w:w="80"/>
+              <w:right w:type="dxa" w:w="100"/>
+            </w:tcMar>
+          </w:tcPr>
+          <w:p>
+            <w:pPr>
+              <w:spacing w:after="0" w:line="275"/>
+            </w:pPr>
+            <w:r>
+              <w:rPr>
+                <w:rFonts w:ascii="Arial" w:cs="Arial" w:eastAsia="Arial" w:hAnsi="Arial"/>
+                <w:b/>
+                <w:bCs/>
+                <w:sz w:val="19"/>
+                <w:szCs w:val="19"/>
+              </w:rPr>
+              <w:t xml:space="preserve">Qué hace con tu información y qué tienes que hacer tú</w:t>
+            </w:r>
+          </w:p>
+        </w:tc>
+      </w:tr>
+      <w:tr>
+        <w:tc>
+          <w:tcPr>
+            <w:tcW w:type="dxa" w:w="2800"/>
+            <w:tcMar>
+              <w:top w:type="dxa" w:w="80"/>
+              <w:left w:type="dxa" w:w="100"/>
+              <w:bottom w:type="dxa" w:w="80"/>
+              <w:right w:type="dxa" w:w="100"/>
+            </w:tcMar>
+          </w:tcPr>
+          <w:p>
+            <w:pPr>
+              <w:spacing w:after="0" w:line="275"/>
+            </w:pPr>
+            <w:r>
+              <w:rPr>
+                <w:rFonts w:ascii="Arial" w:cs="Arial" w:eastAsia="Arial" w:hAnsi="Arial"/>
+                <w:b/>
+                <w:bCs/>
+                <w:sz w:val="19"/>
+                <w:szCs w:val="19"/>
+              </w:rPr>
+              <w:t xml:space="preserve">Microsoft 365 Copilot</w:t>
+            </w:r>
+          </w:p>
+        </w:tc>
+        <w:tc>
+          <w:tcPr>
+            <w:tcW w:type="dxa" w:w="6560"/>
+            <w:tcMar>
+              <w:top w:type="dxa" w:w="80"/>
+              <w:left w:type="dxa" w:w="100"/>
+              <w:bottom w:type="dxa" w:w="80"/>
+              <w:right w:type="dxa" w:w="100"/>
+            </w:tcMar>
+          </w:tcPr>
+          <w:p>
+            <w:pPr>
+              <w:spacing w:after="0" w:line="275"/>
+            </w:pPr>
+            <w:r>
+              <w:rPr>
+                <w:rFonts w:ascii="Arial" w:cs="Arial" w:eastAsia="Arial" w:hAnsi="Arial"/>
+                <w:b w:val="false"/>
+                <w:bCs w:val="false"/>
+                <w:sz w:val="19"/>
+                <w:szCs w:val="19"/>
+              </w:rPr>
+              <w:t xml:space="preserve">Es la única con contrato del Instituto. Microsoft se compromete por escrito a que tus prompts, sus respuestas y los archivos que Copilot lee no se usan para entrenar sus modelos. No es una opción que puedas prender o apagar: viene en el contrato. Con una condición importante: eso aplica solo mientras estés dentro de tu cuenta institucional. Si abres Copilot sin iniciar sesión con tu cuenta del INEGI, sales del contrato. Tu tarea: verificar que entraste con tu cuenta del Instituto.</w:t>
+            </w:r>
+          </w:p>
+        </w:tc>
+      </w:tr>
+      <w:tr>
+        <w:tc>
+          <w:tcPr>
+            <w:tcW w:type="dxa" w:w="2800"/>
+            <w:tcMar>
+              <w:top w:type="dxa" w:w="80"/>
+              <w:left w:type="dxa" w:w="100"/>
+              <w:bottom w:type="dxa" w:w="80"/>
+              <w:right w:type="dxa" w:w="100"/>
+            </w:tcMar>
+          </w:tcPr>
+          <w:p>
+            <w:pPr>
+              <w:spacing w:after="0" w:line="275"/>
+            </w:pPr>
+            <w:r>
+              <w:rPr>
+                <w:rFonts w:ascii="Arial" w:cs="Arial" w:eastAsia="Arial" w:hAnsi="Arial"/>
+                <w:b/>
+                <w:bCs/>
+                <w:sz w:val="19"/>
+                <w:szCs w:val="19"/>
+              </w:rPr>
+              <w:t xml:space="preserve">ChatGPT, Claude, Gemini, Perplexity, You.com, Elicit y Consensus</w:t>
+            </w:r>
+          </w:p>
+        </w:tc>
+        <w:tc>
+          <w:tcPr>
+            <w:tcW w:type="dxa" w:w="6560"/>
+            <w:tcMar>
+              <w:top w:type="dxa" w:w="80"/>
+              <w:left w:type="dxa" w:w="100"/>
+              <w:bottom w:type="dxa" w:w="80"/>
+              <w:right w:type="dxa" w:w="100"/>
+            </w:tcMar>
+          </w:tcPr>
+          <w:p>
+            <w:pPr>
+              <w:spacing w:after="0" w:line="275"/>
+            </w:pPr>
+            <w:r>
+              <w:rPr>
+                <w:rFonts w:ascii="Arial" w:cs="Arial" w:eastAsia="Arial" w:hAnsi="Arial"/>
+                <w:b w:val="false"/>
+                <w:bCs w:val="false"/>
+                <w:sz w:val="19"/>
+                <w:szCs w:val="19"/>
+              </w:rPr>
+              <w:t xml:space="preserve">Ninguna tiene contrato con el Instituto y todas las vas a usar con su plan gratuito. En plan gratuito, estas herramientas usan tus conversaciones para entrenar sus modelos, salvo que tú lo apagues. Viene prendido de fábrica. Tu tarea: apagarlo en cada una, el día que la abras por primera vez.</w:t>
+            </w:r>
+          </w:p>
+        </w:tc>
+      </w:tr>
+    </w:tbl>
+    <w:p>
+      <w:pPr>
+        <w:spacing w:after="160"/>
+      </w:pPr>
     </w:p>
     <w:p>
       <w:pPr>
@@ -1817,6 +2265,101 @@
           <w:sz w:val="22"/>
           <w:szCs w:val="22"/>
         </w:rPr>
+        <w:t xml:space="preserve">Cómo apagar el entrenamiento</w:t>
+      </w:r>
+    </w:p>
+    <w:p>
+      <w:pPr>
+        <w:spacing w:after="90" w:line="280"/>
+        <w:ind w:left="520" w:hanging="260"/>
+        <w:jc w:val="both"/>
+      </w:pPr>
+      <w:r>
+        <w:rPr>
+          <w:rFonts w:ascii="Arial" w:cs="Arial" w:eastAsia="Arial" w:hAnsi="Arial"/>
+          <w:sz w:val="21"/>
+          <w:szCs w:val="21"/>
+        </w:rPr>
+        <w:t xml:space="preserve">•   Entra a la configuración de la herramienta y busca la sección de datos, privacidad o controles de datos.</w:t>
+      </w:r>
+    </w:p>
+    <w:p>
+      <w:pPr>
+        <w:spacing w:after="90" w:line="280"/>
+        <w:ind w:left="520" w:hanging="260"/>
+        <w:jc w:val="both"/>
+      </w:pPr>
+      <w:r>
+        <w:rPr>
+          <w:rFonts w:ascii="Arial" w:cs="Arial" w:eastAsia="Arial" w:hAnsi="Arial"/>
+          <w:sz w:val="21"/>
+          <w:szCs w:val="21"/>
+        </w:rPr>
+        <w:t xml:space="preserve">•   Apaga la opción de mejorar el modelo. El nombre del menú cambia entre herramientas y cambia seguido, pero la opción es siempre la misma.</w:t>
+      </w:r>
+    </w:p>
+    <w:p>
+      <w:pPr>
+        <w:spacing w:after="90" w:line="280"/>
+        <w:ind w:left="520" w:hanging="260"/>
+        <w:jc w:val="both"/>
+      </w:pPr>
+      <w:r>
+        <w:rPr>
+          <w:rFonts w:ascii="Arial" w:cs="Arial" w:eastAsia="Arial" w:hAnsi="Arial"/>
+          <w:sz w:val="21"/>
+          <w:szCs w:val="21"/>
+        </w:rPr>
+        <w:t xml:space="preserve">•   Anota en tu bitácora cuál apagaste y cuándo.</w:t>
+      </w:r>
+    </w:p>
+    <w:p>
+      <w:pPr>
+        <w:spacing w:after="90" w:line="280"/>
+        <w:ind w:left="520" w:hanging="260"/>
+        <w:jc w:val="both"/>
+      </w:pPr>
+      <w:r>
+        <w:rPr>
+          <w:rFonts w:ascii="Arial" w:cs="Arial" w:eastAsia="Arial" w:hAnsi="Arial"/>
+          <w:sz w:val="21"/>
+          <w:szCs w:val="21"/>
+        </w:rPr>
+        <w:t xml:space="preserve">•   Si en alguna no encuentras la opción, anótalo y no subas nada a esa herramienta hasta encontrarla.</w:t>
+      </w:r>
+    </w:p>
+    <w:p>
+      <w:pPr>
+        <w:spacing w:after="120" w:line="285"/>
+        <w:jc w:val="both"/>
+      </w:pPr>
+      <w:r>
+        <w:rPr>
+          <w:rFonts w:ascii="Arial" w:cs="Arial" w:eastAsia="Arial" w:hAnsi="Arial"/>
+          <w:b/>
+          <w:bCs/>
+          <w:i w:val="false"/>
+          <w:iCs w:val="false"/>
+          <w:sz w:val="21"/>
+          <w:szCs w:val="21"/>
+        </w:rPr>
+        <w:t xml:space="preserve">Ojo: apagar el entrenamiento reduce un riesgo, pero no cambia el semáforo. Aun apagado, esas siete siguen siendo solo para información verde.</w:t>
+      </w:r>
+    </w:p>
+    <w:p>
+      <w:pPr>
+        <w:pStyle w:val="Heading2"/>
+        <w:spacing w:after="100" w:before="240"/>
+      </w:pPr>
+      <w:r>
+        <w:rPr>
+          <w:rFonts w:ascii="Arial" w:cs="Arial" w:eastAsia="Arial" w:hAnsi="Arial"/>
+          <w:b/>
+          <w:bCs/>
+          <w:color w:val="2E7D7D"/>
+          <w:sz w:val="22"/>
+          <w:szCs w:val="22"/>
+        </w:rPr>
         <w:t xml:space="preserve">Cómo enmascarar un archivo en cinco minutos</w:t>
       </w:r>
     </w:p>
@@ -2098,7 +2641,7 @@
           <w:sz w:val="21"/>
           <w:szCs w:val="21"/>
         </w:rPr>
-        <w:t xml:space="preserve">•   Puede inventar. Toda salida es un borrador hasta que alguien la verifica.</w:t>
+        <w:t xml:space="preserve">•   El modelo puede inventar. Toda salida es un borrador hasta que alguien la verifica.</w:t>
       </w:r>
     </w:p>
     <w:p>
@@ -2128,7 +2671,7 @@
           <w:sz w:val="21"/>
           <w:szCs w:val="21"/>
         </w:rPr>
-        <w:t xml:space="preserve">•   Tiene un límite de lectura. Lo que no cabe, no lo ve, y no te avisa.</w:t>
+        <w:t xml:space="preserve">•   El modelo tiene un límite de lectura. Lo que no cabe, no lo ve, y no te avisa.</w:t>
       </w:r>
     </w:p>
     <w:p>
@@ -2143,7 +2686,7 @@
           <w:sz w:val="21"/>
           <w:szCs w:val="21"/>
         </w:rPr>
-        <w:t xml:space="preserve">•   No sabe qué importa. Puede dejar fuera el hallazgo central porque ocupaba una frase.</w:t>
+        <w:t xml:space="preserve">•   El modelo no sabe qué importa. Puede dejar fuera el hallazgo central porque ocupaba una frase.</w:t>
       </w:r>
     </w:p>
     <w:p>
@@ -2527,7 +3070,7 @@
         </w:rPr>
         <w:t xml:space="preserve">•   Transparencia. Mata v. Avianca, No. 1:22-cv-01461 (S.D.N.Y.), 22 de junio de 2023. </w:t>
       </w:r>
-      <w:hyperlink w:history="1" r:id="rId46no9zu9fsh1lpqgr8a4_">
+      <w:hyperlink w:history="1" r:id="rIde-q-16negdkepwqvluxri">
         <w:r>
           <w:rPr>
             <w:rFonts w:ascii="Courier New" w:cs="Courier New" w:eastAsia="Courier New" w:hAnsi="Courier New"/>
@@ -2553,7 +3096,7 @@
         </w:rPr>
         <w:t xml:space="preserve">•   Gobierno de datos. Samsung, Forbes, 2 de mayo de 2023. </w:t>
       </w:r>
-      <w:hyperlink w:history="1" r:id="rIdb5wgrl5eampexj0ab8z2-">
+      <w:hyperlink w:history="1" r:id="rIdd-w4rh7bkslu_r9yb1ud6">
         <w:r>
           <w:rPr>
             <w:rFonts w:ascii="Courier New" w:cs="Courier New" w:eastAsia="Courier New" w:hAnsi="Courier New"/>
@@ -2579,7 +3122,7 @@
         </w:rPr>
         <w:t xml:space="preserve">•   Sesgos. Países Bajos, Amnistía Internacional, octubre de 2021. </w:t>
       </w:r>
-      <w:hyperlink w:history="1" r:id="rId-poefcxzogsgz_f7eohm0">
+      <w:hyperlink w:history="1" r:id="rIdczrvahqfqde6zridgvwaw">
         <w:r>
           <w:rPr>
             <w:rFonts w:ascii="Courier New" w:cs="Courier New" w:eastAsia="Courier New" w:hAnsi="Courier New"/>
@@ -2605,7 +3148,7 @@
         </w:rPr>
         <w:t xml:space="preserve">•   Representación. Amazon, Reuters, 10 de octubre de 2018. Regulación posterior en Nueva York: </w:t>
       </w:r>
-      <w:hyperlink w:history="1" r:id="rIdk0evw1d3wvusvvda25n-u">
+      <w:hyperlink w:history="1" r:id="rIdb5o3h6goz9q3ax0yw7yef">
         <w:r>
           <w:rPr>
             <w:rFonts w:ascii="Courier New" w:cs="Courier New" w:eastAsia="Courier New" w:hAnsi="Courier New"/>
@@ -2631,7 +3174,7 @@
         </w:rPr>
         <w:t xml:space="preserve">•   Mayoría. Obermeyer y coautores, Science 366(6464), 2019. </w:t>
       </w:r>
-      <w:hyperlink w:history="1" r:id="rIdd79xpfzv1lh8_kyatyeni">
+      <w:hyperlink w:history="1" r:id="rId9geenzcgzukzsjq7vtebi">
         <w:r>
           <w:rPr>
             <w:rFonts w:ascii="Courier New" w:cs="Courier New" w:eastAsia="Courier New" w:hAnsi="Courier New"/>
@@ -2657,7 +3200,7 @@
         </w:rPr>
         <w:t xml:space="preserve">•   Complacencia. OpenAI, abril y mayo de 2025. </w:t>
       </w:r>
-      <w:hyperlink w:history="1" r:id="rIdkapl7m3fzxvravewnubla">
+      <w:hyperlink w:history="1" r:id="rIdnbl2525vsyhxdvvjz1dse">
         <w:r>
           <w:rPr>
             <w:rFonts w:ascii="Courier New" w:cs="Courier New" w:eastAsia="Courier New" w:hAnsi="Courier New"/>
@@ -2683,7 +3226,7 @@
         </w:rPr>
         <w:t xml:space="preserve">•   Lingüístico. Koenecke y coautores, PNAS 117(14), 2020. </w:t>
       </w:r>
-      <w:hyperlink w:history="1" r:id="rId6w0vq9gcy2nsfrcskwlad">
+      <w:hyperlink w:history="1" r:id="rIdiuvwrejxrbwlsr9r96rcv">
         <w:r>
           <w:rPr>
             <w:rFonts w:ascii="Courier New" w:cs="Courier New" w:eastAsia="Courier New" w:hAnsi="Courier New"/>

</xml_diff>